<commit_message>
冻结 DOCX/XLSX Harbor Oracle 回放快照
</commit_message>
<xml_diff>
--- a/tasks/docx/officeval-022-format-transfer-cover-directory/solution/Golden/企业经营情况说明书_按模板格式添加封面目录.docx
+++ b/tasks/docx/officeval-022-format-transfer-cover-directory/solution/Golden/企业经营情况说明书_按模板格式添加封面目录.docx
@@ -331,7 +331,7 @@
           <w:sz w:val="24"/>
         </w:rPr>
         <w:tab/>
-        <w:t>6</w:t>
+        <w:t>5</w:t>
       </w:r>
     </w:p>
     <w:p>
@@ -355,7 +355,7 @@
           <w:sz w:val="24"/>
         </w:rPr>
         <w:tab/>
-        <w:t>7</w:t>
+        <w:t>6</w:t>
       </w:r>
     </w:p>
     <w:p>
@@ -379,7 +379,7 @@
           <w:sz w:val="24"/>
         </w:rPr>
         <w:tab/>
-        <w:t>8</w:t>
+        <w:t>7</w:t>
       </w:r>
     </w:p>
     <w:p>

</xml_diff>